<commit_message>
docs: perfect 7-page TMRM research review paper with accurate inventor attribution and non-overlapping headers
</commit_message>
<xml_diff>
--- a/reports/TMRM_Comprehensive_Research_Review_Paper.docx
+++ b/reports/TMRM_Comprehensive_Research_Review_Paper.docx
@@ -11,11 +11,23 @@
           <w:rFonts w:ascii="Times New Roman" w:hAnsi="Times New Roman"/>
           <w:b/>
           <w:color w:val="102C57"/>
-          <w:sz w:val="32"/>
+          <w:sz w:val="36"/>
         </w:rPr>
-        <w:t>A Comprehensive State-of-the-Art Review of the Topological Manifold Resonant Machine (TMRM v4.6):</w:t>
-        <w:br/>
-        <w:t>Non-Euclidean Riemannian Geometry, Acoustic Wave Resonance, and Next-Generation Tabular Foundation Models</w:t>
+        <w:t>Topological Manifold Resonant Machine (TMRM)</w:t>
+      </w:r>
+    </w:p>
+    <w:p>
+      <w:pPr>
+        <w:jc w:val="center"/>
+      </w:pPr>
+      <w:r>
+        <w:rPr>
+          <w:rFonts w:ascii="Times New Roman" w:hAnsi="Times New Roman"/>
+          <w:i/>
+          <w:color w:val="334155"/>
+          <w:sz w:val="22"/>
+        </w:rPr>
+        <w:t>A Comprehensive Review of Non-Euclidean Riemannian Wave Resonance for Tabular Predictive Modeling and Industrial Prognostics</w:t>
       </w:r>
     </w:p>
     <w:p>
@@ -28,7 +40,7 @@
           <w:b/>
           <w:sz w:val="22"/>
         </w:rPr>
-        <w:t>BALAJI P1,  NAVANEETHAM V1,  DHAVAN RG1,  Dr. A. RAMACHANDRAN M.E., M.B.A., Ph.D.2*</w:t>
+        <w:t>BALAJI P1,  NAVANEETHAM V1,  DHAVAN RG1</w:t>
       </w:r>
     </w:p>
     <w:p>
@@ -42,13 +54,11 @@
           <w:color w:val="64748B"/>
           <w:sz w:val="19"/>
         </w:rPr>
-        <w:t>1 Lead Algorithm Architects &amp; Primary Research Investigators | Dept. of Artificial Intelligence &amp; Data Science</w:t>
+        <w:t>1 Primary Inventors, Lead Algorithm Architects &amp; Research Investigators | Dept. of Artificial Intelligence &amp; Data Science</w:t>
         <w:br/>
-        <w:t>2 Professor &amp; Academic Research Supervisor | Mentor &amp; Technical Guide</w:t>
+        <w:t>Academic Research Supervisor &amp; Technical Mentor: Dr. A. RAMACHANDRAN M.E., M.B.A., Ph.D. (Professor &amp; Research Supervisor)</w:t>
         <w:br/>
-        <w:t>* Corresponding Academic Supervisor: Dr. A. RAMACHANDRAN M.E., M.B.A., Ph.D.</w:t>
-        <w:br/>
-        <w:t>Advanced Machine Intelligence &amp; Non-Euclidean Computing Laboratory | Comprehensive Survey &amp; Review Monograph</w:t>
+        <w:t>Advanced Machine Intelligence &amp; Non-Euclidean Computing Laboratory | Archival Review Monograph</w:t>
       </w:r>
     </w:p>
     <w:tbl>
@@ -79,20 +89,20 @@
                 <w:b/>
                 <w:sz w:val="19"/>
               </w:rPr>
-              <w:t xml:space="preserve">Abstract- </w:t>
+              <w:t xml:space="preserve">Abstract— </w:t>
             </w:r>
             <w:r>
               <w:rPr>
                 <w:rFonts w:ascii="Times New Roman" w:hAnsi="Times New Roman"/>
                 <w:sz w:val="19"/>
               </w:rPr>
-              <w:t>For over a quarter of a century, tabular and clinical predictive modeling has remained dominated by orthogonal, axis-aligned decision tree ensembles (Random Forest, XGBoost, LightGBM) that recursively bisect feature space along coordinate axes, inducing discontinuous staircase decision boundaries. Conversely, modern deep neural networks have struggled on tabular representations, frequently suffering from hyperparameter instability, excessive computational overhead, and a total absence of finite-sample epistemic safety certificates. This comprehensive review provides a foundational, state-of-the-art architectural synthesis of the Topological Manifold Resonant Machine (TMRM v4.6.0), conceived and developed under the academic research supervision and mentorship of Dr. A. Ramachandran M.E., M.B.A., Ph.D.</w:t>
+              <w:t>For more than two decades, tabular and clinical predictive modeling has remained dominated by orthogonal, axis-aligned decision tree ensembles (Random Forest, XGBoost, LightGBM) that recursively bisect feature space along coordinate axes, inducing discontinuous staircase decision boundaries. Conversely, modern deep neural networks have struggled on tabular representations, frequently suffering from hyperparameter instability, excessive computational overhead, and a total absence of finite-sample epistemic safety certificates. This comprehensive review provides a foundational, state-of-the-art architectural synthesis of the Topological Manifold Resonant Machine (TMRM v4.6.0), invented and developed by Balaji P, Navaneetham V, and Dhavan RG under the academic research supervision of Dr. A. Ramachandran M.E., M.B.A., Ph.D.</w:t>
               <w:br/>
               <w:br/>
               <w:t>TMRM fundamentally discards discrete coordinate bisections, reformulating machine learning as an acoustic standing wave resonance problem situated on continuous, curved Riemannian manifolds. In this review, we deconstruct the entire theoretical, geometric, and physical architecture of TMRM without code or pseudocode abstractions, providing an intuitive, rigorous conceptual guide for researchers and industry practitioners. We systematically explain: (1) why data points are conceptualized as physical energy masses within localized potential energy wells; (2) how anisotropic metric tensors G_k equipped with Ledoit-Wolf diagonal target shrinkage capture complex physiological and multi-sensor covariance ellipses; (3) how multi-axis principal eigenvector wave resonators capture true three-dimensional volumetric vibrations across three dyadic octaves; (4) how discrete binary and categorical survey data are handled via dynamic Discrete Hypercube Adaptation; (5) how the optimal dual wave amplitudes are solved in closed form within milliseconds via class-balanced weighted Generalized Cross-Validation (GCV); and (6) how inductive conformal prediction provides certified, distribution-free finite-sample confidence guarantees.</w:t>
               <w:br/>
               <w:br/>
-              <w:t>Index Terms- Tabular Foundation Models, Review and Survey, Riemannian Manifolds, Wave Resonance, Metric Tensors, Generalized Cross-Validation, Conformal Epistemic Risk, Prognostics.</w:t>
+              <w:t>Index Terms— Tabular Foundation Models, Review and Survey, Riemannian Manifolds, Wave Resonance, Metric Tensors, Generalized Cross-Validation, Conformal Epistemic Risk, Prognostics.</w:t>
             </w:r>
           </w:p>
         </w:tc>
@@ -121,7 +131,7 @@
           <w:rFonts w:ascii="Times New Roman" w:hAnsi="Times New Roman"/>
           <w:sz w:val="20"/>
         </w:rPr>
-        <w:t>Over the past fifteen years, deep representation learning has revolutionized unstructured perceptual domains. Yet, in tabular predictive modeling-which constitutes more than 85% of real-world industrial, clinical, and cyber-physical datasets-tabular modeling remains anchored to an algorithmic paradigm introduced over two decades ago: axis-aligned orthogonal decision tree ensembles (Random Forest, XGBoost, LightGBM). While these ensembles are undeniably robust to monotonic transformations, they suffer from fundamental, incurable geometric deficiencies rooted in their foundational premise. To address this structural crisis, a research initiative led by algorithm architects Balaji P, Navaneetham V, and Dhavan RG was formulated under the academic research supervision and intellectual mentorship of Dr. A. Ramachandran M.E., M.B.A., Ph.D. This effort culminated in the Topological Manifold Resonant Machine (TMRM v4.6.0), which reconstructs predictive modeling from first principles by uniting Riemannian differential geometry with acoustic wave electrodynamics.</w:t>
+        <w:t>Over the past fifteen years, deep representation learning has revolutionized unstructured perceptual domains. Yet, in tabular predictive modeling—which constitutes more than 85% of real-world industrial, clinical, and cyber-physical datasets—tabular modeling remains anchored to an algorithmic paradigm introduced over two decades ago: axis-aligned orthogonal decision tree ensembles (Random Forest, XGBoost, LightGBM). While these ensembles are undeniably robust to monotonic transformations, they suffer from fundamental, incurable geometric deficiencies rooted in their foundational premise. To address this structural crisis, a research initiative led by algorithm inventors Balaji P, Navaneetham V, and Dhavan RG was formulated under the academic research supervision and intellectual mentorship of Dr. A. Ramachandran M.E., M.B.A., Ph.D. This effort culminated in the Topological Manifold Resonant Machine (TMRM v4.6.0), which reconstructs predictive modeling from first principles by uniting Riemannian differential geometry with acoustic wave electrodynamics.</w:t>
       </w:r>
     </w:p>
     <w:p>
@@ -147,7 +157,7 @@
           <w:rFonts w:ascii="Times New Roman" w:hAnsi="Times New Roman"/>
           <w:sz w:val="20"/>
         </w:rPr>
-        <w:t>Decision trees partition feature space strictly along axis-aligned hyperplanes (if feature_j &gt; threshold). When nature produces smooth, diagonal, spherical, or curved relationships-such as the inverse correlation between cardiac ejection fraction and coronary stenosis-an orthogonal tree cannot represent the boundary directly. Instead, it must approximate the smooth curve by taking dozens of tiny horizontal and vertical stair-steps. This staircase artifact creates severe boundary errors, high variance in the presence of noise, and abrupt, unphysical classification jumps. Furthermore, approximating a curved D-dimensional spherical envelope requires packing an exponential number of axis-aligned hypercubes Omega((R / (epsilon * sqrt(D)))^D), causing severe leaf explosion and pruning loss in high dimensions.</w:t>
+        <w:t>Decision trees partition feature space strictly along axis-aligned hyperplanes (if feature_j &gt; threshold). When nature produces smooth, diagonal, spherical, or curved relationships—such as the inverse correlation between cardiac ejection fraction and coronary stenosis—an orthogonal tree cannot represent the boundary directly. Instead, it must approximate the smooth curve by taking dozens of tiny horizontal and vertical stair-steps. This staircase artifact creates severe boundary errors, high variance in the presence of noise, and abrupt, unphysical classification jumps. Furthermore, approximating a curved D-dimensional spherical envelope requires packing an exponential number of axis-aligned hypercubes Omega((R / (epsilon * sqrt(D)))^D), causing severe leaf explosion and pruning loss in high dimensions.</w:t>
       </w:r>
     </w:p>
     <w:p>
@@ -397,7 +407,7 @@
                 <w:color w:val="FFFFFF"/>
                 <w:sz w:val="17"/>
               </w:rPr>
-              <w:t>Empirical Advantage</w:t>
+              <w:t>Empirical Margin</w:t>
             </w:r>
           </w:p>
         </w:tc>
@@ -482,7 +492,7 @@
                 <w:b/>
                 <w:sz w:val="17"/>
               </w:rPr>
-              <w:t>+4.44% Margin</w:t>
+              <w:t>+4.44% Lead</w:t>
             </w:r>
           </w:p>
         </w:tc>
@@ -564,7 +574,7 @@
                 <w:b/>
                 <w:sz w:val="17"/>
               </w:rPr>
-              <w:t>+2.36% Margin</w:t>
+              <w:t>+2.36% Lead</w:t>
             </w:r>
           </w:p>
         </w:tc>
@@ -646,7 +656,7 @@
                 <w:b/>
                 <w:sz w:val="17"/>
               </w:rPr>
-              <w:t>+0.07% Margin</w:t>
+              <w:t>+0.07% Lead</w:t>
             </w:r>
           </w:p>
         </w:tc>
@@ -892,7 +902,7 @@
                 <w:b/>
                 <w:sz w:val="17"/>
               </w:rPr>
-              <w:t>+1.03% Margin</w:t>
+              <w:t>+1.03% Lead</w:t>
             </w:r>
           </w:p>
         </w:tc>
@@ -974,7 +984,7 @@
                 <w:b/>
                 <w:sz w:val="17"/>
               </w:rPr>
-              <w:t>+0.97% Margin</w:t>
+              <w:t>+0.97% Lead</w:t>
             </w:r>
           </w:p>
         </w:tc>
@@ -1056,7 +1066,7 @@
                 <w:b/>
                 <w:sz w:val="17"/>
               </w:rPr>
-              <w:t>+1.33% Margin</w:t>
+              <w:t>+1.33% Lead</w:t>
             </w:r>
           </w:p>
         </w:tc>
@@ -1138,7 +1148,7 @@
                 <w:b/>
                 <w:sz w:val="17"/>
               </w:rPr>
-              <w:t>+1.13% Margin</w:t>
+              <w:t>+1.13% Lead</w:t>
             </w:r>
           </w:p>
         </w:tc>
@@ -1288,7 +1298,7 @@
           <w:rFonts w:ascii="Times New Roman" w:hAnsi="Times New Roman"/>
           <w:sz w:val="20"/>
         </w:rPr>
-        <w:t>The primary algorithm architects and research investigators (Balaji P, Navaneetham V, and Dhavan RG) express their profound gratitude, intellectual indebtedness, and highest esteem to their research supervisor and mentor, Dr. A. RAMACHANDRAN M.E., M.B.A., Ph.D. (Professor &amp; Academic Research Supervisor, Advanced Machine Intelligence &amp; Non-Euclidean Computing Laboratory). His visionary guidance, methodological discipline, and foundational insights in non-Euclidean differential geometry, high-dimensional covariance regularization, and physical wave mechanics were paramount in shaping the Topological Manifold Resonant Machine architecture from an initial mathematical concept into an internationally competitive predictive foundation model.</w:t>
+        <w:t>The primary algorithm inventors and research architects (Balaji P, Navaneetham V, and Dhavan RG) express their profound gratitude, intellectual indebtedness, and highest esteem to their research supervisor and mentor, Dr. A. RAMACHANDRAN M.E., M.B.A., Ph.D. (Professor &amp; Academic Research Supervisor, Advanced Machine Intelligence &amp; Non-Euclidean Computing Laboratory). His visionary guidance, methodological discipline, and foundational insights in non-Euclidean differential geometry, high-dimensional covariance regularization, and physical wave mechanics were paramount in shaping the Topological Manifold Resonant Machine architecture from an initial mathematical concept into an internationally competitive predictive foundation model.</w:t>
       </w:r>
     </w:p>
     <w:p>
@@ -1422,7 +1432,7 @@
           <w:rFonts w:ascii="Times New Roman" w:hAnsi="Times New Roman"/>
           <w:sz w:val="20"/>
         </w:rPr>
-        <w:t>[10] A. Ramachandran, Advanced Non-Euclidean Differential Formulations in Machine Intelligence and High-Dimensional Systems, Academic Research Monographs, 2024.</w:t>
+        <w:t>[10] P. Balaji, V. Navaneetham, and R. G. Dhavan, 'Topological Manifold Resonant Machine: Mathematical Foundations and Predictive Formulations,' Dept. AI &amp; DS Academic Treatise, 2026.</w:t>
       </w:r>
     </w:p>
     <w:p>
@@ -1434,7 +1444,7 @@
           <w:rFonts w:ascii="Times New Roman" w:hAnsi="Times New Roman"/>
           <w:sz w:val="20"/>
         </w:rPr>
-        <w:t>[11] P. Balaji, V. Navaneetham, R. G. Dhavan, and A. Ramachandran, 'Topological Manifold Resonant Machine: Mathematical Foundations and Continuous Predictive Formulations,' Dept. AI &amp; DS Academic Treatise, 2026.</w:t>
+        <w:t>[11] A. Ramachandran, Advanced Non-Euclidean Differential Formulations in Machine Intelligence, Academic Research Monographs, 2024.</w:t>
       </w:r>
     </w:p>
     <w:p>

</xml_diff>